<commit_message>
feat: fix input after PO demo regarding information note #BKDO-1032
</commit_message>
<xml_diff>
--- a/src/Bk.APG.Api/Templates/InformationNote_German.docx
+++ b/src/Bk.APG.Api/Templates/InformationNote_German.docx
@@ -5931,23 +5931,21 @@
     </w:p>
     <w:p>
       <w:pPr>
-        <w:rPr>
-          <w:rFonts w:cs="Arial"/>
-        </w:rPr>
-      </w:pPr>
-      <w:r>
-        <w:rPr>
-          <w:rFonts w:cs="Arial"/>
+        <w:spacing w:after="120"/>
+        <w:rPr>
+          <w:rFonts w:cs="Arial"/>
+          <w:u w:val="single"/>
+          <w:lang w:eastAsia="de-DE"/>
+        </w:rPr>
+      </w:pPr>
+      <w:r>
+        <w:rPr>
+          <w:rFonts w:cs="Arial"/>
+          <w:u w:val="single"/>
+          <w:lang w:eastAsia="de-DE"/>
         </w:rPr>
         <w:t>Vertretungen des Bundes</w:t>
       </w:r>
-    </w:p>
-    <w:p>
-      <w:pPr>
-        <w:rPr>
-          <w:rFonts w:cs="Arial"/>
-        </w:rPr>
-      </w:pPr>
     </w:p>
     <w:tbl>
       <w:tblPr>
@@ -10301,7 +10299,47 @@
           <w:sz w:val="16"/>
           <w:szCs w:val="16"/>
         </w:rPr>
-        <w:t>Nicht berücksichtigt sind die 19 Kommissionen, welche noch nicht für die Gesamterneuerungswahlen freigegeben wurden.</w:t>
+        <w:t xml:space="preserve">Nicht berücksichtigt sind die </w:t>
+      </w:r>
+      <w:r>
+        <w:rPr>
+          <w:rFonts w:cs="Arial"/>
+          <w:sz w:val="16"/>
+          <w:szCs w:val="16"/>
+        </w:rPr>
+        <w:t>&lt;&lt;[informationNote.</w:t>
+      </w:r>
+      <w:r>
+        <w:rPr>
+          <w:rFonts w:cs="Arial"/>
+          <w:sz w:val="16"/>
+          <w:szCs w:val="16"/>
+        </w:rPr>
+        <w:t>u</w:t>
+      </w:r>
+      <w:r>
+        <w:rPr>
+          <w:rFonts w:cs="Arial"/>
+          <w:sz w:val="16"/>
+          <w:szCs w:val="16"/>
+        </w:rPr>
+        <w:t>nreleasedExtraParliamentaryCommittees</w:t>
+      </w:r>
+      <w:r>
+        <w:rPr>
+          <w:rFonts w:cs="Arial"/>
+          <w:sz w:val="16"/>
+          <w:szCs w:val="16"/>
+        </w:rPr>
+        <w:t>]&gt;&gt;</w:t>
+      </w:r>
+      <w:r>
+        <w:rPr>
+          <w:rFonts w:cs="Arial"/>
+          <w:sz w:val="16"/>
+          <w:szCs w:val="16"/>
+        </w:rPr>
+        <w:t xml:space="preserve"> Kommissionen, welche noch nicht für die Gesamterneuerungswahlen freigegeben wurden.</w:t>
       </w:r>
     </w:p>
   </w:footnote>
@@ -10335,7 +10373,47 @@
           <w:sz w:val="16"/>
           <w:szCs w:val="16"/>
         </w:rPr>
-        <w:t>Nicht berücksichtigt sind die 19 Kommissionen, welche noch nicht für die Gesamterneuerungswahlen freigegeben wurden.</w:t>
+        <w:t xml:space="preserve">Nicht berücksichtigt sind die </w:t>
+      </w:r>
+      <w:r>
+        <w:rPr>
+          <w:rFonts w:cs="Arial"/>
+          <w:sz w:val="16"/>
+          <w:szCs w:val="16"/>
+        </w:rPr>
+        <w:t>&lt;&lt;[informationNote.</w:t>
+      </w:r>
+      <w:r>
+        <w:rPr>
+          <w:rFonts w:cs="Arial"/>
+          <w:sz w:val="16"/>
+          <w:szCs w:val="16"/>
+        </w:rPr>
+        <w:t>u</w:t>
+      </w:r>
+      <w:r>
+        <w:rPr>
+          <w:rFonts w:cs="Arial"/>
+          <w:sz w:val="16"/>
+          <w:szCs w:val="16"/>
+        </w:rPr>
+        <w:t>nreleasedExtraParliamentaryCommittees</w:t>
+      </w:r>
+      <w:r>
+        <w:rPr>
+          <w:rFonts w:cs="Arial"/>
+          <w:sz w:val="16"/>
+          <w:szCs w:val="16"/>
+        </w:rPr>
+        <w:t>]&gt;&gt;</w:t>
+      </w:r>
+      <w:r>
+        <w:rPr>
+          <w:rFonts w:cs="Arial"/>
+          <w:sz w:val="16"/>
+          <w:szCs w:val="16"/>
+        </w:rPr>
+        <w:t xml:space="preserve"> Kommissionen, welche noch nicht für die Gesamterneuerungswahlen freigegeben wurden.</w:t>
       </w:r>
     </w:p>
   </w:footnote>

</xml_diff>

<commit_message>
feat: fix missing/wrong data on information note #BKDO-1032
</commit_message>
<xml_diff>
--- a/src/Bk.APG.Api/Templates/InformationNote_German.docx
+++ b/src/Bk.APG.Api/Templates/InformationNote_German.docx
@@ -1377,7 +1377,7 @@
       <w:tr>
         <w:tc>
           <w:tcPr>
-            <w:tcW w:w="2830" w:type="dxa"/>
+            <w:tcW w:w="2796" w:type="dxa"/>
           </w:tcPr>
           <w:p>
             <w:pPr>
@@ -1389,7 +1389,7 @@
         </w:tc>
         <w:tc>
           <w:tcPr>
-            <w:tcW w:w="1276" w:type="dxa"/>
+            <w:tcW w:w="1323" w:type="dxa"/>
           </w:tcPr>
           <w:p>
             <w:pPr>
@@ -1403,6 +1403,25 @@
                 <w:rFonts w:cs="Arial"/>
               </w:rPr>
               <w:t>1 Vakanz</w:t>
+            </w:r>
+          </w:p>
+        </w:tc>
+        <w:tc>
+          <w:tcPr>
+            <w:tcW w:w="1555" w:type="dxa"/>
+          </w:tcPr>
+          <w:p>
+            <w:pPr>
+              <w:jc w:val="center"/>
+              <w:rPr>
+                <w:rFonts w:cs="Arial"/>
+              </w:rPr>
+            </w:pPr>
+            <w:r>
+              <w:rPr>
+                <w:rFonts w:cs="Arial"/>
+              </w:rPr>
+              <w:t>2 Vakanzen</w:t>
             </w:r>
           </w:p>
         </w:tc>
@@ -1421,32 +1440,13 @@
               <w:rPr>
                 <w:rFonts w:cs="Arial"/>
               </w:rPr>
-              <w:t>2 Vakanzen</w:t>
+              <w:t>3 Vakanzen</w:t>
             </w:r>
           </w:p>
         </w:tc>
         <w:tc>
           <w:tcPr>
-            <w:tcW w:w="1560" w:type="dxa"/>
-          </w:tcPr>
-          <w:p>
-            <w:pPr>
-              <w:jc w:val="center"/>
-              <w:rPr>
-                <w:rFonts w:cs="Arial"/>
-              </w:rPr>
-            </w:pPr>
-            <w:r>
-              <w:rPr>
-                <w:rFonts w:cs="Arial"/>
-              </w:rPr>
-              <w:t>3 Vakanzen</w:t>
-            </w:r>
-          </w:p>
-        </w:tc>
-        <w:tc>
-          <w:tcPr>
-            <w:tcW w:w="1824" w:type="dxa"/>
+            <w:tcW w:w="1816" w:type="dxa"/>
           </w:tcPr>
           <w:p>
             <w:pPr>
@@ -1467,7 +1467,7 @@
       <w:tr>
         <w:tc>
           <w:tcPr>
-            <w:tcW w:w="2830" w:type="dxa"/>
+            <w:tcW w:w="2796" w:type="dxa"/>
           </w:tcPr>
           <w:p>
             <w:pPr>
@@ -1485,7 +1485,7 @@
         </w:tc>
         <w:tc>
           <w:tcPr>
-            <w:tcW w:w="1276" w:type="dxa"/>
+            <w:tcW w:w="1323" w:type="dxa"/>
           </w:tcPr>
           <w:p>
             <w:pPr>
@@ -1505,6 +1505,37 @@
                 <w:rFonts w:cs="Arial"/>
               </w:rPr>
               <w:t>oneVacanciesAuthoritiesCommittees</w:t>
+            </w:r>
+            <w:r>
+              <w:rPr>
+                <w:rFonts w:cs="Arial"/>
+              </w:rPr>
+              <w:t>]&gt;&gt;</w:t>
+            </w:r>
+          </w:p>
+        </w:tc>
+        <w:tc>
+          <w:tcPr>
+            <w:tcW w:w="1555" w:type="dxa"/>
+          </w:tcPr>
+          <w:p>
+            <w:pPr>
+              <w:jc w:val="center"/>
+              <w:rPr>
+                <w:rFonts w:cs="Arial"/>
+              </w:rPr>
+            </w:pPr>
+            <w:r>
+              <w:rPr>
+                <w:rFonts w:cs="Arial"/>
+              </w:rPr>
+              <w:t>&lt;&lt;[informationNote.</w:t>
+            </w:r>
+            <w:r>
+              <w:rPr>
+                <w:rFonts w:cs="Arial"/>
+              </w:rPr>
+              <w:t>twoVacanciesAuthoritiesCommittees</w:t>
             </w:r>
             <w:r>
               <w:rPr>
@@ -1535,7 +1566,7 @@
               <w:rPr>
                 <w:rFonts w:cs="Arial"/>
               </w:rPr>
-              <w:t>twoVacanciesAuthoritiesCommittees</w:t>
+              <w:t>threeVacanciesAuthoritiesCommittees</w:t>
             </w:r>
             <w:r>
               <w:rPr>
@@ -1547,38 +1578,7 @@
         </w:tc>
         <w:tc>
           <w:tcPr>
-            <w:tcW w:w="1560" w:type="dxa"/>
-          </w:tcPr>
-          <w:p>
-            <w:pPr>
-              <w:jc w:val="center"/>
-              <w:rPr>
-                <w:rFonts w:cs="Arial"/>
-              </w:rPr>
-            </w:pPr>
-            <w:r>
-              <w:rPr>
-                <w:rFonts w:cs="Arial"/>
-              </w:rPr>
-              <w:t>&lt;&lt;[informationNote.</w:t>
-            </w:r>
-            <w:r>
-              <w:rPr>
-                <w:rFonts w:cs="Arial"/>
-              </w:rPr>
-              <w:t>threeVacanciesAuthoritiesCommittees</w:t>
-            </w:r>
-            <w:r>
-              <w:rPr>
-                <w:rFonts w:cs="Arial"/>
-              </w:rPr>
-              <w:t>]&gt;&gt;</w:t>
-            </w:r>
-          </w:p>
-        </w:tc>
-        <w:tc>
-          <w:tcPr>
-            <w:tcW w:w="1824" w:type="dxa"/>
+            <w:tcW w:w="1816" w:type="dxa"/>
           </w:tcPr>
           <w:p>
             <w:pPr>
@@ -1611,7 +1611,7 @@
       <w:tr>
         <w:tc>
           <w:tcPr>
-            <w:tcW w:w="2830" w:type="dxa"/>
+            <w:tcW w:w="2796" w:type="dxa"/>
           </w:tcPr>
           <w:p>
             <w:pPr>
@@ -1629,7 +1629,7 @@
         </w:tc>
         <w:tc>
           <w:tcPr>
-            <w:tcW w:w="1276" w:type="dxa"/>
+            <w:tcW w:w="1323" w:type="dxa"/>
           </w:tcPr>
           <w:p>
             <w:pPr>
@@ -1649,6 +1649,37 @@
                 <w:rFonts w:cs="Arial"/>
               </w:rPr>
               <w:t>oneVacanciesAdministrationCommittees</w:t>
+            </w:r>
+            <w:r>
+              <w:rPr>
+                <w:rFonts w:cs="Arial"/>
+              </w:rPr>
+              <w:t>]&gt;&gt;</w:t>
+            </w:r>
+          </w:p>
+        </w:tc>
+        <w:tc>
+          <w:tcPr>
+            <w:tcW w:w="1555" w:type="dxa"/>
+          </w:tcPr>
+          <w:p>
+            <w:pPr>
+              <w:jc w:val="center"/>
+              <w:rPr>
+                <w:rFonts w:cs="Arial"/>
+              </w:rPr>
+            </w:pPr>
+            <w:r>
+              <w:rPr>
+                <w:rFonts w:cs="Arial"/>
+              </w:rPr>
+              <w:t>&lt;&lt;[informationNote.</w:t>
+            </w:r>
+            <w:r>
+              <w:rPr>
+                <w:rFonts w:cs="Arial"/>
+              </w:rPr>
+              <w:t>twoVacanciesAdministrationCommittees</w:t>
             </w:r>
             <w:r>
               <w:rPr>
@@ -1679,7 +1710,7 @@
               <w:rPr>
                 <w:rFonts w:cs="Arial"/>
               </w:rPr>
-              <w:t>twoVacanciesAdministrationCommittees</w:t>
+              <w:t>threeVacanciesAdministrationCommittees</w:t>
             </w:r>
             <w:r>
               <w:rPr>
@@ -1691,38 +1722,7 @@
         </w:tc>
         <w:tc>
           <w:tcPr>
-            <w:tcW w:w="1560" w:type="dxa"/>
-          </w:tcPr>
-          <w:p>
-            <w:pPr>
-              <w:jc w:val="center"/>
-              <w:rPr>
-                <w:rFonts w:cs="Arial"/>
-              </w:rPr>
-            </w:pPr>
-            <w:r>
-              <w:rPr>
-                <w:rFonts w:cs="Arial"/>
-              </w:rPr>
-              <w:t>&lt;&lt;[informationNote.</w:t>
-            </w:r>
-            <w:r>
-              <w:rPr>
-                <w:rFonts w:cs="Arial"/>
-              </w:rPr>
-              <w:t>threeVacanciesAdministrationCommittees</w:t>
-            </w:r>
-            <w:r>
-              <w:rPr>
-                <w:rFonts w:cs="Arial"/>
-              </w:rPr>
-              <w:t>]&gt;&gt;</w:t>
-            </w:r>
-          </w:p>
-        </w:tc>
-        <w:tc>
-          <w:tcPr>
-            <w:tcW w:w="1824" w:type="dxa"/>
+            <w:tcW w:w="1816" w:type="dxa"/>
           </w:tcPr>
           <w:p>
             <w:pPr>
@@ -1761,7 +1761,7 @@
       <w:tr>
         <w:tc>
           <w:tcPr>
-            <w:tcW w:w="2830" w:type="dxa"/>
+            <w:tcW w:w="2796" w:type="dxa"/>
           </w:tcPr>
           <w:p>
             <w:pPr>
@@ -1779,7 +1779,7 @@
         </w:tc>
         <w:tc>
           <w:tcPr>
-            <w:tcW w:w="1276" w:type="dxa"/>
+            <w:tcW w:w="1323" w:type="dxa"/>
           </w:tcPr>
           <w:p>
             <w:pPr>
@@ -1799,6 +1799,37 @@
                 <w:rFonts w:cs="Arial"/>
               </w:rPr>
               <w:t>oneVacanciesManagementCommittees</w:t>
+            </w:r>
+            <w:r>
+              <w:rPr>
+                <w:rFonts w:cs="Arial"/>
+              </w:rPr>
+              <w:t>]&gt;&gt;</w:t>
+            </w:r>
+          </w:p>
+        </w:tc>
+        <w:tc>
+          <w:tcPr>
+            <w:tcW w:w="1555" w:type="dxa"/>
+          </w:tcPr>
+          <w:p>
+            <w:pPr>
+              <w:jc w:val="center"/>
+              <w:rPr>
+                <w:rFonts w:cs="Arial"/>
+              </w:rPr>
+            </w:pPr>
+            <w:r>
+              <w:rPr>
+                <w:rFonts w:cs="Arial"/>
+              </w:rPr>
+              <w:t>&lt;&lt;[informationNote.</w:t>
+            </w:r>
+            <w:r>
+              <w:rPr>
+                <w:rFonts w:cs="Arial"/>
+              </w:rPr>
+              <w:t>twoVacanciesManagementCommittees</w:t>
             </w:r>
             <w:r>
               <w:rPr>
@@ -1829,7 +1860,7 @@
               <w:rPr>
                 <w:rFonts w:cs="Arial"/>
               </w:rPr>
-              <w:t>twoVacanciesManagementCommittees</w:t>
+              <w:t>threeVacanciesManagementCommittees</w:t>
             </w:r>
             <w:r>
               <w:rPr>
@@ -1841,38 +1872,7 @@
         </w:tc>
         <w:tc>
           <w:tcPr>
-            <w:tcW w:w="1560" w:type="dxa"/>
-          </w:tcPr>
-          <w:p>
-            <w:pPr>
-              <w:jc w:val="center"/>
-              <w:rPr>
-                <w:rFonts w:cs="Arial"/>
-              </w:rPr>
-            </w:pPr>
-            <w:r>
-              <w:rPr>
-                <w:rFonts w:cs="Arial"/>
-              </w:rPr>
-              <w:t>&lt;&lt;[informationNote.</w:t>
-            </w:r>
-            <w:r>
-              <w:rPr>
-                <w:rFonts w:cs="Arial"/>
-              </w:rPr>
-              <w:t>threeVacanciesManagementCommittees</w:t>
-            </w:r>
-            <w:r>
-              <w:rPr>
-                <w:rFonts w:cs="Arial"/>
-              </w:rPr>
-              <w:t>]&gt;&gt;</w:t>
-            </w:r>
-          </w:p>
-        </w:tc>
-        <w:tc>
-          <w:tcPr>
-            <w:tcW w:w="1824" w:type="dxa"/>
+            <w:tcW w:w="1816" w:type="dxa"/>
           </w:tcPr>
           <w:p>
             <w:pPr>
@@ -1905,7 +1905,7 @@
       <w:tr>
         <w:tc>
           <w:tcPr>
-            <w:tcW w:w="2830" w:type="dxa"/>
+            <w:tcW w:w="2796" w:type="dxa"/>
           </w:tcPr>
           <w:p>
             <w:pPr>
@@ -1918,16 +1918,14 @@
             <w:r>
               <w:rPr>
                 <w:rFonts w:cs="Arial"/>
-                <w:b/>
-                <w:bCs/>
-              </w:rPr>
-              <w:t>Total</w:t>
+              </w:rPr>
+              <w:t>Vertretungen des Bundes</w:t>
             </w:r>
           </w:p>
         </w:tc>
         <w:tc>
           <w:tcPr>
-            <w:tcW w:w="1276" w:type="dxa"/>
+            <w:tcW w:w="1323" w:type="dxa"/>
           </w:tcPr>
           <w:p>
             <w:pPr>
@@ -1941,26 +1939,67 @@
             <w:r>
               <w:rPr>
                 <w:rFonts w:cs="Arial"/>
+              </w:rPr>
+              <w:t>&lt;&lt;[informationNote.</w:t>
+            </w:r>
+            <w:r>
+              <w:rPr>
+                <w:rFonts w:cs="Arial"/>
+              </w:rPr>
+              <w:t>oneVacancies</w:t>
+            </w:r>
+            <w:r>
+              <w:rPr>
+                <w:rFonts w:cs="Arial"/>
+              </w:rPr>
+              <w:t>FederalAgenci</w:t>
+            </w:r>
+            <w:r>
+              <w:rPr>
+                <w:rFonts w:cs="Arial"/>
+              </w:rPr>
+              <w:lastRenderedPageBreak/>
+              <w:t>esCommittees]&gt;&gt;</w:t>
+            </w:r>
+          </w:p>
+        </w:tc>
+        <w:tc>
+          <w:tcPr>
+            <w:tcW w:w="1555" w:type="dxa"/>
+          </w:tcPr>
+          <w:p>
+            <w:pPr>
+              <w:jc w:val="center"/>
+              <w:rPr>
+                <w:rFonts w:cs="Arial"/>
                 <w:b/>
                 <w:bCs/>
               </w:rPr>
+            </w:pPr>
+            <w:r>
+              <w:rPr>
+                <w:rFonts w:cs="Arial"/>
+              </w:rPr>
+              <w:lastRenderedPageBreak/>
               <w:t>&lt;&lt;[informationNote.</w:t>
             </w:r>
             <w:r>
               <w:rPr>
                 <w:rFonts w:cs="Arial"/>
-                <w:b/>
-                <w:bCs/>
-              </w:rPr>
-              <w:t>oneVacanciesTotal</w:t>
-            </w:r>
-            <w:r>
-              <w:rPr>
-                <w:rFonts w:cs="Arial"/>
-                <w:b/>
-                <w:bCs/>
-              </w:rPr>
-              <w:t>]&gt;&gt;</w:t>
+              </w:rPr>
+              <w:t>two</w:t>
+            </w:r>
+            <w:r>
+              <w:rPr>
+                <w:rFonts w:cs="Arial"/>
+              </w:rPr>
+              <w:t>Vacancies</w:t>
+            </w:r>
+            <w:r>
+              <w:rPr>
+                <w:rFonts w:cs="Arial"/>
+              </w:rPr>
+              <w:t>FederalAgenciesCommittees]&gt;&gt;</w:t>
             </w:r>
           </w:p>
         </w:tc>
@@ -1980,32 +2019,32 @@
             <w:r>
               <w:rPr>
                 <w:rFonts w:cs="Arial"/>
-                <w:b/>
-                <w:bCs/>
               </w:rPr>
               <w:t>&lt;&lt;[informationNote.</w:t>
             </w:r>
             <w:r>
               <w:rPr>
                 <w:rFonts w:cs="Arial"/>
-                <w:b/>
-                <w:bCs/>
-              </w:rPr>
-              <w:t>twoVacanciesTotal</w:t>
-            </w:r>
-            <w:r>
-              <w:rPr>
-                <w:rFonts w:cs="Arial"/>
-                <w:b/>
-                <w:bCs/>
-              </w:rPr>
-              <w:t>]&gt;&gt;</w:t>
+              </w:rPr>
+              <w:t>three</w:t>
+            </w:r>
+            <w:r>
+              <w:rPr>
+                <w:rFonts w:cs="Arial"/>
+              </w:rPr>
+              <w:t>Vacancies</w:t>
+            </w:r>
+            <w:r>
+              <w:rPr>
+                <w:rFonts w:cs="Arial"/>
+              </w:rPr>
+              <w:t>FederalAgenciesCommittees]&gt;&gt;</w:t>
             </w:r>
           </w:p>
         </w:tc>
         <w:tc>
           <w:tcPr>
-            <w:tcW w:w="1560" w:type="dxa"/>
+            <w:tcW w:w="1816" w:type="dxa"/>
           </w:tcPr>
           <w:p>
             <w:pPr>
@@ -2019,32 +2058,173 @@
             <w:r>
               <w:rPr>
                 <w:rFonts w:cs="Arial"/>
+              </w:rPr>
+              <w:t>&lt;&lt;[informationNote.</w:t>
+            </w:r>
+            <w:r>
+              <w:rPr>
+                <w:rFonts w:cs="Arial"/>
+              </w:rPr>
+              <w:t>four</w:t>
+            </w:r>
+            <w:r>
+              <w:rPr>
+                <w:rFonts w:cs="Arial"/>
+              </w:rPr>
+              <w:t>Vacancies</w:t>
+            </w:r>
+            <w:r>
+              <w:rPr>
+                <w:rFonts w:cs="Arial"/>
+              </w:rPr>
+              <w:t>FederalAgenciesCommittees]&gt;&gt;</w:t>
+            </w:r>
+          </w:p>
+        </w:tc>
+      </w:tr>
+      <w:tr>
+        <w:tc>
+          <w:tcPr>
+            <w:tcW w:w="2796" w:type="dxa"/>
+          </w:tcPr>
+          <w:p>
+            <w:pPr>
+              <w:rPr>
+                <w:rFonts w:cs="Arial"/>
                 <w:b/>
                 <w:bCs/>
               </w:rPr>
-              <w:t>&lt;&lt;[informationNote.</w:t>
-            </w:r>
+            </w:pPr>
             <w:r>
               <w:rPr>
                 <w:rFonts w:cs="Arial"/>
                 <w:b/>
                 <w:bCs/>
               </w:rPr>
-              <w:t>threeVacanciesTotal</w:t>
-            </w:r>
-            <w:r>
-              <w:rPr>
-                <w:rFonts w:cs="Arial"/>
-                <w:b/>
-                <w:bCs/>
-              </w:rPr>
-              <w:t>]&gt;&gt;</w:t>
+              <w:t>Total</w:t>
             </w:r>
           </w:p>
         </w:tc>
         <w:tc>
           <w:tcPr>
-            <w:tcW w:w="1824" w:type="dxa"/>
+            <w:tcW w:w="1323" w:type="dxa"/>
+          </w:tcPr>
+          <w:p>
+            <w:pPr>
+              <w:jc w:val="center"/>
+              <w:rPr>
+                <w:rFonts w:cs="Arial"/>
+                <w:b/>
+                <w:bCs/>
+              </w:rPr>
+            </w:pPr>
+            <w:r>
+              <w:rPr>
+                <w:rFonts w:cs="Arial"/>
+                <w:b/>
+                <w:bCs/>
+              </w:rPr>
+              <w:t>&lt;&lt;[informationNote.</w:t>
+            </w:r>
+            <w:r>
+              <w:rPr>
+                <w:rFonts w:cs="Arial"/>
+                <w:b/>
+                <w:bCs/>
+              </w:rPr>
+              <w:t>oneVacanciesTotal</w:t>
+            </w:r>
+            <w:r>
+              <w:rPr>
+                <w:rFonts w:cs="Arial"/>
+                <w:b/>
+                <w:bCs/>
+              </w:rPr>
+              <w:t>]&gt;&gt;</w:t>
+            </w:r>
+          </w:p>
+        </w:tc>
+        <w:tc>
+          <w:tcPr>
+            <w:tcW w:w="1555" w:type="dxa"/>
+          </w:tcPr>
+          <w:p>
+            <w:pPr>
+              <w:jc w:val="center"/>
+              <w:rPr>
+                <w:rFonts w:cs="Arial"/>
+                <w:b/>
+                <w:bCs/>
+              </w:rPr>
+            </w:pPr>
+            <w:r>
+              <w:rPr>
+                <w:rFonts w:cs="Arial"/>
+                <w:b/>
+                <w:bCs/>
+              </w:rPr>
+              <w:t>&lt;&lt;[informationNote.</w:t>
+            </w:r>
+            <w:r>
+              <w:rPr>
+                <w:rFonts w:cs="Arial"/>
+                <w:b/>
+                <w:bCs/>
+              </w:rPr>
+              <w:t>twoVacanciesTotal</w:t>
+            </w:r>
+            <w:r>
+              <w:rPr>
+                <w:rFonts w:cs="Arial"/>
+                <w:b/>
+                <w:bCs/>
+              </w:rPr>
+              <w:t>]&gt;&gt;</w:t>
+            </w:r>
+          </w:p>
+        </w:tc>
+        <w:tc>
+          <w:tcPr>
+            <w:tcW w:w="1559" w:type="dxa"/>
+          </w:tcPr>
+          <w:p>
+            <w:pPr>
+              <w:jc w:val="center"/>
+              <w:rPr>
+                <w:rFonts w:cs="Arial"/>
+                <w:b/>
+                <w:bCs/>
+              </w:rPr>
+            </w:pPr>
+            <w:r>
+              <w:rPr>
+                <w:rFonts w:cs="Arial"/>
+                <w:b/>
+                <w:bCs/>
+              </w:rPr>
+              <w:t>&lt;&lt;[informationNote.</w:t>
+            </w:r>
+            <w:r>
+              <w:rPr>
+                <w:rFonts w:cs="Arial"/>
+                <w:b/>
+                <w:bCs/>
+              </w:rPr>
+              <w:t>threeVacanciesTotal</w:t>
+            </w:r>
+            <w:r>
+              <w:rPr>
+                <w:rFonts w:cs="Arial"/>
+                <w:b/>
+                <w:bCs/>
+              </w:rPr>
+              <w:t>]&gt;&gt;</w:t>
+            </w:r>
+          </w:p>
+        </w:tc>
+        <w:tc>
+          <w:tcPr>
+            <w:tcW w:w="1816" w:type="dxa"/>
           </w:tcPr>
           <w:p>
             <w:pPr>

</xml_diff>